<commit_message>
readded(032 form for student copy)
- Re-uploaded document
</commit_message>
<xml_diff>
--- a/forms_3d_printing_student_copy.docx
+++ b/forms_3d_printing_student_copy.docx
@@ -239,13 +239,7 @@
               <w:rPr>
                 <w:noProof/>
               </w:rPr>
-              <w:t>00</w:t>
-            </w:r>
-            <w:r>
-              <w:rPr>
-                <w:noProof/>
-              </w:rPr>
-              <w:t>2</w:t>
+              <w:t>002</w:t>
             </w:r>
           </w:p>
         </w:tc>
@@ -280,7 +274,7 @@
                 <w:noProof/>
               </w:rPr>
               <w:drawing>
-                <wp:inline distT="0" distB="0" distL="0" distR="0" wp14:anchorId="336F3525" wp14:editId="5F5E75AA">
+                <wp:inline distT="0" distB="0" distL="0" distR="0" wp14:anchorId="336F3525" wp14:editId="271F1733">
                   <wp:extent cx="1243584" cy="1209252"/>
                   <wp:effectExtent l="0" t="0" r="1270" b="0"/>
                   <wp:docPr id="2052255624" name="Picture 17" descr="A white plate with a round object on it&#10;&#10;Description automatically generated"/>
@@ -415,7 +409,7 @@
                 <w:noProof/>
               </w:rPr>
               <w:drawing>
-                <wp:inline distT="0" distB="0" distL="0" distR="0" wp14:anchorId="39507C0C" wp14:editId="787AB5D8">
+                <wp:inline distT="0" distB="0" distL="0" distR="0" wp14:anchorId="39507C0C" wp14:editId="2D1C0601">
                   <wp:extent cx="1789210" cy="2203306"/>
                   <wp:effectExtent l="0" t="3810" r="0" b="0"/>
                   <wp:docPr id="525095174" name="Picture 3" descr="A close-up of a hat being poured into a plate&#10;&#10;Description automatically generated"/>
@@ -1055,7 +1049,7 @@
                 <w:noProof/>
               </w:rPr>
               <w:drawing>
-                <wp:inline distT="0" distB="0" distL="0" distR="0" wp14:anchorId="366063EE" wp14:editId="2AE66F2A">
+                <wp:inline distT="0" distB="0" distL="0" distR="0" wp14:anchorId="366063EE" wp14:editId="1E1F2D5D">
                   <wp:extent cx="1243584" cy="1357113"/>
                   <wp:effectExtent l="0" t="0" r="1270" b="1905"/>
                   <wp:docPr id="1691268125" name="Picture 33"/>
@@ -1279,7 +1273,7 @@
                 <w:noProof/>
               </w:rPr>
               <w:drawing>
-                <wp:inline distT="0" distB="0" distL="0" distR="0" wp14:anchorId="482130DE" wp14:editId="392DF341">
+                <wp:inline distT="0" distB="0" distL="0" distR="0" wp14:anchorId="482130DE" wp14:editId="7A86BD75">
                   <wp:extent cx="1614722" cy="1420522"/>
                   <wp:effectExtent l="0" t="4763" r="0" b="0"/>
                   <wp:docPr id="277762905" name="Picture 11" descr="A close-up of a roll of white material&#10;&#10;Description automatically generated"/>
@@ -1595,7 +1589,7 @@
                 <w:noProof/>
               </w:rPr>
               <w:drawing>
-                <wp:inline distT="0" distB="0" distL="0" distR="0" wp14:anchorId="50192BF5" wp14:editId="0D66C85C">
+                <wp:inline distT="0" distB="0" distL="0" distR="0" wp14:anchorId="50192BF5" wp14:editId="364119C7">
                   <wp:extent cx="1430078" cy="826618"/>
                   <wp:effectExtent l="0" t="0" r="5080" b="0"/>
                   <wp:docPr id="616027703" name="Picture 14" descr="A close-up of a machine&#10;&#10;Description automatically generated"/>
@@ -2030,7 +2024,7 @@
                 <w:noProof/>
               </w:rPr>
               <w:drawing>
-                <wp:inline distT="0" distB="0" distL="0" distR="0" wp14:anchorId="0F6E317F" wp14:editId="5FD7B571">
+                <wp:inline distT="0" distB="0" distL="0" distR="0" wp14:anchorId="0F6E317F" wp14:editId="63F7D8B2">
                   <wp:extent cx="1087795" cy="1192119"/>
                   <wp:effectExtent l="0" t="1270" r="3175" b="3175"/>
                   <wp:docPr id="294613010" name="Picture 19" descr="A close-up of a machine&#10;&#10;Description automatically generated"/>
@@ -2227,7 +2221,7 @@
                 <w:noProof/>
               </w:rPr>
               <w:drawing>
-                <wp:inline distT="0" distB="0" distL="0" distR="0" wp14:anchorId="22F8F021" wp14:editId="62C6399E">
+                <wp:inline distT="0" distB="0" distL="0" distR="0" wp14:anchorId="22F8F021" wp14:editId="7BB82F34">
                   <wp:extent cx="1404518" cy="1314109"/>
                   <wp:effectExtent l="0" t="0" r="5715" b="0"/>
                   <wp:docPr id="572547111" name="Picture 22"/>
@@ -3067,6 +3061,20 @@
               <w:t>028</w:t>
             </w:r>
           </w:p>
+          <w:p>
+            <w:pPr>
+              <w:jc w:val="center"/>
+              <w:rPr>
+                <w:noProof/>
+              </w:rPr>
+            </w:pPr>
+            <w:r>
+              <w:rPr>
+                <w:noProof/>
+              </w:rPr>
+              <w:t>(unavailable due to printing issue)</w:t>
+            </w:r>
+          </w:p>
         </w:tc>
       </w:tr>
       <w:tr>
@@ -3255,9 +3263,9 @@
                 <w:noProof/>
               </w:rPr>
               <w:drawing>
-                <wp:inline distT="0" distB="0" distL="0" distR="0" wp14:anchorId="50BB4C27" wp14:editId="3C654637">
-                  <wp:extent cx="1499616" cy="1415381"/>
-                  <wp:effectExtent l="0" t="0" r="0" b="0"/>
+                <wp:inline distT="0" distB="0" distL="0" distR="0" wp14:anchorId="50BB4C27" wp14:editId="0358AB81">
+                  <wp:extent cx="1333041" cy="1258163"/>
+                  <wp:effectExtent l="0" t="0" r="635" b="0"/>
                   <wp:docPr id="1060427740" name="Picture 9"/>
                   <wp:cNvGraphicFramePr>
                     <a:graphicFrameLocks xmlns:a="http://schemas.openxmlformats.org/drawingml/2006/main" noChangeAspect="1"/>
@@ -3284,7 +3292,7 @@
                         <pic:spPr>
                           <a:xfrm>
                             <a:off x="0" y="0"/>
-                            <a:ext cx="1536307" cy="1450011"/>
+                            <a:ext cx="1378646" cy="1301207"/>
                           </a:xfrm>
                           <a:prstGeom prst="rect">
                             <a:avLst/>
@@ -3318,14 +3326,93 @@
           </w:p>
         </w:tc>
       </w:tr>
+      <w:tr>
+        <w:trPr>
+          <w:jc w:val="center"/>
+        </w:trPr>
+        <w:tc>
+          <w:tcPr>
+            <w:tcW w:w="5745" w:type="dxa"/>
+          </w:tcPr>
+          <w:p>
+            <w:pPr>
+              <w:jc w:val="center"/>
+              <w:rPr>
+                <w:noProof/>
+              </w:rPr>
+            </w:pPr>
+            <w:r>
+              <w:rPr>
+                <w:noProof/>
+              </w:rPr>
+              <w:drawing>
+                <wp:inline distT="0" distB="0" distL="0" distR="0" wp14:anchorId="106AA88E" wp14:editId="66D118CA">
+                  <wp:extent cx="2029843" cy="1289960"/>
+                  <wp:effectExtent l="0" t="0" r="2540" b="5715"/>
+                  <wp:docPr id="1888562643" name="Picture 1" descr="A white object on a black background&#10;&#10;Description automatically generated"/>
+                  <wp:cNvGraphicFramePr>
+                    <a:graphicFrameLocks xmlns:a="http://schemas.openxmlformats.org/drawingml/2006/main" noChangeAspect="1"/>
+                  </wp:cNvGraphicFramePr>
+                  <a:graphic xmlns:a="http://schemas.openxmlformats.org/drawingml/2006/main">
+                    <a:graphicData uri="http://schemas.openxmlformats.org/drawingml/2006/picture">
+                      <pic:pic xmlns:pic="http://schemas.openxmlformats.org/drawingml/2006/picture">
+                        <pic:nvPicPr>
+                          <pic:cNvPr id="191970140" name="Picture 1" descr="A white object on a black background&#10;&#10;Description automatically generated"/>
+                          <pic:cNvPicPr/>
+                        </pic:nvPicPr>
+                        <pic:blipFill>
+                          <a:blip r:embed="rId49" cstate="print">
+                            <a:extLst>
+                              <a:ext uri="{28A0092B-C50C-407E-A947-70E740481C1C}">
+                                <a14:useLocalDpi xmlns:a14="http://schemas.microsoft.com/office/drawing/2010/main" val="0"/>
+                              </a:ext>
+                            </a:extLst>
+                          </a:blip>
+                          <a:stretch>
+                            <a:fillRect/>
+                          </a:stretch>
+                        </pic:blipFill>
+                        <pic:spPr>
+                          <a:xfrm>
+                            <a:off x="0" y="0"/>
+                            <a:ext cx="2067215" cy="1313710"/>
+                          </a:xfrm>
+                          <a:prstGeom prst="rect">
+                            <a:avLst/>
+                          </a:prstGeom>
+                        </pic:spPr>
+                      </pic:pic>
+                    </a:graphicData>
+                  </a:graphic>
+                </wp:inline>
+              </w:drawing>
+            </w:r>
+          </w:p>
+        </w:tc>
+        <w:tc>
+          <w:tcPr>
+            <w:tcW w:w="2194" w:type="dxa"/>
+          </w:tcPr>
+          <w:p>
+            <w:pPr>
+              <w:jc w:val="center"/>
+              <w:rPr>
+                <w:noProof/>
+              </w:rPr>
+            </w:pPr>
+            <w:r>
+              <w:rPr>
+                <w:noProof/>
+              </w:rPr>
+              <w:t>032</w:t>
+            </w:r>
+          </w:p>
+        </w:tc>
+      </w:tr>
     </w:tbl>
-    <w:p>
-      <w:pPr>
-        <w:jc w:val="center"/>
-      </w:pPr>
-    </w:p>
+    <w:p/>
     <w:sectPr>
-      <w:headerReference w:type="default" r:id="rId49"/>
+      <w:headerReference w:type="default" r:id="rId50"/>
       <w:pgSz w:w="11906" w:h="16838"/>
       <w:pgMar w:top="1440" w:right="1440" w:bottom="1440" w:left="1440" w:header="708" w:footer="708" w:gutter="0"/>
       <w:cols w:space="708"/>

</xml_diff>